<commit_message>
Pre-final version of Part 1 completed
</commit_message>
<xml_diff>
--- a/resources/toDo.docx
+++ b/resources/toDo.docx
@@ -123,7 +123,7 @@
     <w:p>
       <w:pPr>
         <w:rPr>
-          <w:lang w:val="en-US"/>
+          <w:lang w:val="ru-RU"/>
         </w:rPr>
       </w:pPr>
       <w:r>
@@ -135,7 +135,88 @@
       </w:r>
       <w:r>
         <w:br/>
-        <w:t>Review potentially over-detailed explanatory passages (Essence/Quintessence, Green–Red conflict, Resonator, threat mode, training/technology, rules of the Delta, etc.). Look for places where explanation can be shortened, distributed across later scenes, or implied rather than stated without losing information needed for the trilogy. Also check repeated descriptions of gestures, surroundings, and Mac’s reactions. Use the BookLife Critic’s Report as an external reader signal, not as an instruction to cut automatically.</w:t>
+        <w:t xml:space="preserve">Review potentially over-detailed explanatory passages (Essence/Quintessence, Green–Red conflict, Resonator, threat mode, training/technology, rules of the Delta, etc.). Look for places where explanation can be shortened, distributed across later scenes, or implied rather than stated without losing information needed for the trilogy. Also check repeated descriptions of gestures, surroundings, and Mac’s reactions. Use the </w:t>
+      </w:r>
+      <w:proofErr w:type="spellStart"/>
+      <w:r>
+        <w:t>BookLife</w:t>
+      </w:r>
+      <w:proofErr w:type="spellEnd"/>
+      <w:r>
+        <w:t xml:space="preserve"> Critic’s Report as an external reader signal, not as an instruction to cut automatically.</w:t>
+      </w:r>
+    </w:p>
+    <w:p>
+      <w:pPr>
+        <w:rPr>
+          <w:lang w:val="ru-RU"/>
+        </w:rPr>
+      </w:pPr>
+      <w:r>
+        <w:rPr>
+          <w:lang w:val="ru-RU"/>
+        </w:rPr>
+        <w:t xml:space="preserve">3. </w:t>
+      </w:r>
+      <w:r>
+        <w:rPr>
+          <w:lang w:val="ru-RU"/>
+        </w:rPr>
+        <w:t xml:space="preserve">Унифицировать английскую типографику кавычек: заменить </w:t>
+      </w:r>
+      <w:r>
+        <w:t>straight</w:t>
+      </w:r>
+      <w:r>
+        <w:rPr>
+          <w:lang w:val="ru-RU"/>
+        </w:rPr>
+        <w:t xml:space="preserve"> </w:t>
+      </w:r>
+      <w:r>
+        <w:t>quotes</w:t>
+      </w:r>
+      <w:r>
+        <w:rPr>
+          <w:lang w:val="ru-RU"/>
+        </w:rPr>
+        <w:t>/</w:t>
+      </w:r>
+      <w:r>
+        <w:t>apostrophes</w:t>
+      </w:r>
+      <w:r>
+        <w:rPr>
+          <w:lang w:val="ru-RU"/>
+        </w:rPr>
+        <w:t xml:space="preserve"> на </w:t>
+      </w:r>
+      <w:r>
+        <w:t>curly</w:t>
+      </w:r>
+      <w:r>
+        <w:rPr>
+          <w:lang w:val="ru-RU"/>
+        </w:rPr>
+        <w:t>/</w:t>
+      </w:r>
+      <w:r>
+        <w:t>smart</w:t>
+      </w:r>
+      <w:r>
+        <w:rPr>
+          <w:lang w:val="ru-RU"/>
+        </w:rPr>
+        <w:t xml:space="preserve"> </w:t>
+      </w:r>
+      <w:r>
+        <w:t>quotes</w:t>
+      </w:r>
+      <w:r>
+        <w:rPr>
+          <w:lang w:val="ru-RU"/>
+        </w:rPr>
+        <w:t xml:space="preserve"> (“…”, ‘…’, ’) по всей рукописи.</w:t>
       </w:r>
     </w:p>
     <w:sectPr>
@@ -754,7 +835,6 @@
   <w:style w:type="character" w:default="1" w:styleId="DefaultParagraphFont">
     <w:name w:val="Default Paragraph Font"/>
     <w:uiPriority w:val="1"/>
-    <w:semiHidden/>
     <w:unhideWhenUsed/>
   </w:style>
   <w:style w:type="table" w:default="1" w:styleId="TableNormal">

</xml_diff>